<commit_message>
generate vacation request file
</commit_message>
<xml_diff>
--- a/src/modules/document-export/templates/vacation.docx
+++ b/src/modules/document-export/templates/vacation.docx
@@ -51,7 +51,7 @@
           <w:sz w:val="22"/>
           <w:shd w:fill="auto" w:val="clear"/>
         </w:rPr>
-        <w:t xml:space="preserve">Иванову И.И.</w:t>
+        <w:t xml:space="preserve">Петрову А.В.</w:t>
       </w:r>
     </w:p>
     <w:p>
@@ -77,18 +77,29 @@
           <w:sz w:val="22"/>
           <w:shd w:fill="auto" w:val="clear"/>
         </w:rPr>
-        <w:t xml:space="preserve">От </w:t>
-      </w:r>
-      <w:r>
-        <w:rPr>
-          <w:rFonts w:ascii="Times New Roman" w:hAnsi="Times New Roman" w:cs="Times New Roman" w:eastAsia="Times New Roman"/>
-          <w:color w:val="auto"/>
-          <w:spacing w:val="0"/>
-          <w:position w:val="0"/>
-          <w:sz w:val="22"/>
-          <w:shd w:fill="auto" w:val="clear"/>
-        </w:rPr>
-        <w:t xml:space="preserve">{name_short_dative}.</w:t>
+        <w:t xml:space="preserve">От {name_short_</w:t>
+      </w:r>
+      <w:r>
+        <w:rPr>
+          <w:rFonts w:ascii="Times New Roman" w:hAnsi="Times New Roman" w:cs="Times New Roman" w:eastAsia="Times New Roman"/>
+          <w:color w:val="auto"/>
+          <w:spacing w:val="0"/>
+          <w:position w:val="0"/>
+          <w:sz w:val="22"/>
+          <w:shd w:fill="auto" w:val="clear"/>
+        </w:rPr>
+        <w:t xml:space="preserve">genitive</w:t>
+      </w:r>
+      <w:r>
+        <w:rPr>
+          <w:rFonts w:ascii="Times New Roman" w:hAnsi="Times New Roman" w:cs="Times New Roman" w:eastAsia="Times New Roman"/>
+          <w:color w:val="auto"/>
+          <w:spacing w:val="0"/>
+          <w:position w:val="0"/>
+          <w:sz w:val="22"/>
+          <w:shd w:fill="auto" w:val="clear"/>
+        </w:rPr>
+        <w:t xml:space="preserve">}.</w:t>
       </w:r>
     </w:p>
     <w:p>
@@ -231,51 +242,7 @@
           <w:sz w:val="22"/>
           <w:shd w:fill="auto" w:val="clear"/>
         </w:rPr>
-        <w:t xml:space="preserve">Прошу предоставить мне очередной ежегодный оплачиваемый отпуск с </w:t>
-      </w:r>
-      <w:r>
-        <w:rPr>
-          <w:rFonts w:ascii="Times New Roman" w:hAnsi="Times New Roman" w:cs="Times New Roman" w:eastAsia="Times New Roman"/>
-          <w:color w:val="auto"/>
-          <w:spacing w:val="0"/>
-          <w:position w:val="0"/>
-          <w:sz w:val="22"/>
-          <w:shd w:fill="auto" w:val="clear"/>
-        </w:rPr>
-        <w:t xml:space="preserve">{start_date} </w:t>
-      </w:r>
-      <w:r>
-        <w:rPr>
-          <w:rFonts w:ascii="Times New Roman" w:hAnsi="Times New Roman" w:cs="Times New Roman" w:eastAsia="Times New Roman"/>
-          <w:color w:val="auto"/>
-          <w:spacing w:val="0"/>
-          <w:position w:val="0"/>
-          <w:sz w:val="22"/>
-          <w:shd w:fill="auto" w:val="clear"/>
-        </w:rPr>
-        <w:t xml:space="preserve">по </w:t>
-      </w:r>
-      <w:r>
-        <w:rPr>
-          <w:rFonts w:ascii="Times New Roman" w:hAnsi="Times New Roman" w:cs="Times New Roman" w:eastAsia="Times New Roman"/>
-          <w:color w:val="auto"/>
-          <w:spacing w:val="0"/>
-          <w:position w:val="0"/>
-          <w:sz w:val="22"/>
-          <w:shd w:fill="auto" w:val="clear"/>
-        </w:rPr>
-        <w:t xml:space="preserve">{end_date} {year} </w:t>
-      </w:r>
-      <w:r>
-        <w:rPr>
-          <w:rFonts w:ascii="Times New Roman" w:hAnsi="Times New Roman" w:cs="Times New Roman" w:eastAsia="Times New Roman"/>
-          <w:color w:val="auto"/>
-          <w:spacing w:val="0"/>
-          <w:position w:val="0"/>
-          <w:sz w:val="22"/>
-          <w:shd w:fill="auto" w:val="clear"/>
-        </w:rPr>
-        <w:t xml:space="preserve">года.</w:t>
+        <w:t xml:space="preserve">Прошу предоставить мне очередной ежегодный оплачиваемый отпуск с {start_date} по {end_date}.</w:t>
       </w:r>
     </w:p>
     <w:p>
@@ -317,29 +284,18 @@
           <w:sz w:val="22"/>
           <w:shd w:fill="auto" w:val="clear"/>
         </w:rPr>
-        <w:t xml:space="preserve">{created_at}</w:t>
-      </w:r>
-      <w:r>
-        <w:rPr>
-          <w:rFonts w:ascii="Times New Roman" w:hAnsi="Times New Roman" w:cs="Times New Roman" w:eastAsia="Times New Roman"/>
-          <w:color w:val="auto"/>
-          <w:spacing w:val="0"/>
-          <w:position w:val="0"/>
-          <w:sz w:val="22"/>
-          <w:shd w:fill="auto" w:val="clear"/>
-        </w:rPr>
-        <w:t xml:space="preserve"> г. ________________ </w:t>
-      </w:r>
-      <w:r>
-        <w:rPr>
-          <w:rFonts w:ascii="Times New Roman" w:hAnsi="Times New Roman" w:cs="Times New Roman" w:eastAsia="Times New Roman"/>
-          <w:color w:val="auto"/>
-          <w:spacing w:val="0"/>
-          <w:position w:val="0"/>
-          <w:sz w:val="22"/>
-          <w:shd w:fill="auto" w:val="clear"/>
-        </w:rPr>
-        <w:t xml:space="preserve">/{name_short_nominative}/</w:t>
+        <w:t xml:space="preserve">{created_at} </w:t>
+      </w:r>
+      <w:r>
+        <w:rPr>
+          <w:rFonts w:ascii="Times New Roman" w:hAnsi="Times New Roman" w:cs="Times New Roman" w:eastAsia="Times New Roman"/>
+          <w:color w:val="auto"/>
+          <w:spacing w:val="0"/>
+          <w:position w:val="0"/>
+          <w:sz w:val="22"/>
+          <w:shd w:fill="auto" w:val="clear"/>
+        </w:rPr>
+        <w:t xml:space="preserve">г. ________________ /{name_short_nominative}/</w:t>
       </w:r>
     </w:p>
   </w:body>

</xml_diff>